<commit_message>
Modification tableau de sources
</commit_message>
<xml_diff>
--- a/Source-E5.docx
+++ b/Source-E5.docx
@@ -153,7 +153,23 @@
           </w:tcPr>
           <w:p>
             <w:r>
-              <w:t>Grosse entreprise de conseil et d’audit l’article a été écrit pas Stéphane Villard Responsable de Techologie,  Médias , Télécommunication depuis plus de 20 ans</w:t>
+              <w:t xml:space="preserve">Grosse entreprise de conseil et d’audit l’article a été écrit </w:t>
+            </w:r>
+            <w:proofErr w:type="spellStart"/>
+            <w:r>
+              <w:t>pas</w:t>
+            </w:r>
+            <w:proofErr w:type="spellEnd"/>
+            <w:r>
+              <w:t xml:space="preserve"> Stéphane Villard Responsable de </w:t>
+            </w:r>
+            <w:proofErr w:type="spellStart"/>
+            <w:r>
+              <w:t>Techologie</w:t>
+            </w:r>
+            <w:proofErr w:type="spellEnd"/>
+            <w:r>
+              <w:t>,  Médias , Télécommunication depuis plus de 20 ans</w:t>
             </w:r>
           </w:p>
         </w:tc>
@@ -208,7 +224,15 @@
           </w:p>
           <w:p>
             <w:r>
-              <w:t>Même si c’est un étudiant on voit qu’il est conscencieux dans son article car il utilise un vocabulaire assez technique et qu’il met des bouts de codes pour appuyer ces propos et est créateur d’un projet spécifique à l’IA comme on peut le voir dans son portfolio</w:t>
+              <w:t xml:space="preserve">Même si c’est un étudiant on voit qu’il est </w:t>
+            </w:r>
+            <w:proofErr w:type="spellStart"/>
+            <w:r>
+              <w:t>conscencieux</w:t>
+            </w:r>
+            <w:proofErr w:type="spellEnd"/>
+            <w:r>
+              <w:t xml:space="preserve"> dans son article car il utilise un vocabulaire assez technique et qu’il met des bouts de codes pour appuyer ces propos et est créateur d’un projet spécifique à l’IA comme on peut le voir dans son portfolio</w:t>
             </w:r>
           </w:p>
         </w:tc>
@@ -546,7 +570,15 @@
           </w:tcPr>
           <w:p>
             <w:r>
-              <w:t xml:space="preserve">Article du journal ZDNet journal reconnu dans le monde de l’informatique spécialisée uniquement dans l’informatique et </w:t>
+              <w:t xml:space="preserve">Article du journal </w:t>
+            </w:r>
+            <w:proofErr w:type="spellStart"/>
+            <w:r>
+              <w:t>ZDNet</w:t>
+            </w:r>
+            <w:proofErr w:type="spellEnd"/>
+            <w:r>
+              <w:t xml:space="preserve"> journal reconnu dans le monde de l’informatique spécialisée uniquement dans l’informatique et </w:t>
             </w:r>
             <w:r>
               <w:lastRenderedPageBreak/>
@@ -573,7 +605,7 @@
         <w:gridCol w:w="1595"/>
         <w:gridCol w:w="905"/>
         <w:gridCol w:w="5249"/>
-        <w:gridCol w:w="1807"/>
+        <w:gridCol w:w="1667"/>
       </w:tblGrid>
       <w:tr>
         <w:tc>
@@ -670,8 +702,13 @@
               <w:t>L</w:t>
             </w:r>
             <w:r>
-              <w:t>e leader mondial du Cloud Computing</w:t>
-            </w:r>
+              <w:t xml:space="preserve">e leader mondial du Cloud </w:t>
+            </w:r>
+            <w:proofErr w:type="spellStart"/>
+            <w:r>
+              <w:t>Computing</w:t>
+            </w:r>
+            <w:proofErr w:type="spellEnd"/>
           </w:p>
         </w:tc>
       </w:tr>
@@ -755,7 +792,14 @@
               <w:rPr>
                 <w:lang w:val="en-US"/>
               </w:rPr>
-              <w:t>Get started with Serverless AI Chat using LlamaIndex - JavaScript on Azure</w:t>
+              <w:t xml:space="preserve">Get started with Serverless AI Chat using LlamaIndex - </w:t>
+            </w:r>
+            <w:r>
+              <w:rPr>
+                <w:lang w:val="en-US"/>
+              </w:rPr>
+              <w:lastRenderedPageBreak/>
+              <w:t>JavaScript on Azure</w:t>
             </w:r>
           </w:p>
         </w:tc>
@@ -765,6 +809,7 @@
           </w:tcPr>
           <w:p>
             <w:r>
+              <w:lastRenderedPageBreak/>
               <w:t>Mise à jour le 30 j</w:t>
             </w:r>
             <w:r>
@@ -788,14 +833,11 @@
           </w:tcPr>
           <w:p>
             <w:r>
-              <w:t xml:space="preserve">L’article provient de Microsoft Learn, la plateforme de documentation et de formation </w:t>
+              <w:t xml:space="preserve">Parle de Rag un service officiel d’IA sans serveur de Microsoft. Dis comment </w:t>
             </w:r>
             <w:r>
               <w:lastRenderedPageBreak/>
-              <w:t xml:space="preserve">officielle </w:t>
-            </w:r>
-            <w:r>
-              <w:t>de Microsoft l’un des leaders dans le domaine des nouvelles technologies</w:t>
+              <w:t>l’utiliser. En lien avec Azure</w:t>
             </w:r>
           </w:p>
         </w:tc>
@@ -847,7 +889,6 @@
           </w:tcPr>
           <w:p>
             <w:r>
-              <w:lastRenderedPageBreak/>
               <w:t>Titre</w:t>
             </w:r>
           </w:p>
@@ -891,6 +932,7 @@
           </w:tcPr>
           <w:p>
             <w:r>
+              <w:lastRenderedPageBreak/>
               <w:t>Arm dévoile sa puce AGI pour l'IA agentique</w:t>
             </w:r>
           </w:p>
@@ -967,7 +1009,23 @@
           </w:tcPr>
           <w:p>
             <w:r>
-              <w:t>Surveillance en temps réel des agents ia . Agents ia font déjà certaines tâches à la place des employés mais font des erreurs. Les agents IA peuvent échapper au contrôle de l’humain dans leurs fonctionnements.</w:t>
+              <w:t xml:space="preserve">Surveillance en temps réel des agents </w:t>
+            </w:r>
+            <w:proofErr w:type="spellStart"/>
+            <w:r>
+              <w:t>ia</w:t>
+            </w:r>
+            <w:proofErr w:type="spellEnd"/>
+            <w:r>
+              <w:t xml:space="preserve"> . Agents </w:t>
+            </w:r>
+            <w:proofErr w:type="spellStart"/>
+            <w:r>
+              <w:t>ia</w:t>
+            </w:r>
+            <w:proofErr w:type="spellEnd"/>
+            <w:r>
+              <w:t xml:space="preserve"> font déjà certaines tâches à la place des employés mais font des erreurs. Les agents IA peuvent échapper au contrôle de l’humain dans leurs fonctionnements.</w:t>
             </w:r>
           </w:p>
         </w:tc>

</xml_diff>